<commit_message>
Add links section to the system explainer
New section 19 collects every URL in one place: the six live surfaces,
the repository, the four rule packs, and the engine module behind each
section, so a reader can jump from any claim to the code that makes it.

Section 16's surface table now carries full live URLs rather than bare
paths. All 24 repo links verified against git ls-files.

Legal citations are deliberately left unlinked, with a note saying why:
they were quoted from the rule pack, not fetched from the issuing bodies.

Co-Authored-By: Claude Opus 5 <noreply@anthropic.com>
Claude-Session: https://claude.ai/code/session_012d1asJR27H3JSBHLVC2w7C
</commit_message>
<xml_diff>
--- a/Sourced-System-Explainer.docx
+++ b/Sourced-System-Explainer.docx
@@ -28,7 +28,7 @@
         </w:p>
       </w:sdtContent>
     </w:sdt>
-    <w:bookmarkStart w:id="81" w:name="sourced-how-the-system-works"/>
+    <w:bookmarkStart w:id="119" w:name="sourced-how-the-system-works"/>
     <w:p>
       <w:pPr>
         <w:pStyle w:val="Heading1"/>
@@ -14684,7 +14684,7 @@
     </w:p>
     <w:bookmarkEnd w:id="70"/>
     <w:bookmarkEnd w:id="71"/>
-    <w:bookmarkStart w:id="74" w:name="the-four-surfaces"/>
+    <w:bookmarkStart w:id="80" w:name="the-four-surfaces"/>
     <w:p>
       <w:pPr>
         <w:pStyle w:val="Heading2"/>
@@ -14738,17 +14738,6 @@
               <w:pStyle w:val="Compact"/>
             </w:pPr>
             <w:r>
-              <w:t xml:space="preserve">Path</w:t>
-            </w:r>
-          </w:p>
-        </w:tc>
-        <w:tc>
-          <w:tcPr/>
-          <w:p>
-            <w:pPr>
-              <w:pStyle w:val="Compact"/>
-            </w:pPr>
-            <w:r>
               <w:t xml:space="preserve">Surface</w:t>
             </w:r>
           </w:p>
@@ -14760,6 +14749,17 @@
               <w:pStyle w:val="Compact"/>
             </w:pPr>
             <w:r>
+              <w:t xml:space="preserve">Live URL</w:t>
+            </w:r>
+          </w:p>
+        </w:tc>
+        <w:tc>
+          <w:tcPr/>
+          <w:p>
+            <w:pPr>
+              <w:pStyle w:val="Compact"/>
+            </w:pPr>
+            <w:r>
               <w:t xml:space="preserve">Who uses it</w:t>
             </w:r>
           </w:p>
@@ -14777,20 +14777,6 @@
         </w:tc>
       </w:tr>
       <w:tr>
-        <w:tc>
-          <w:tcPr/>
-          <w:p>
-            <w:pPr>
-              <w:pStyle w:val="Compact"/>
-            </w:pPr>
-            <w:r>
-              <w:rPr>
-                <w:rStyle w:val="VerbatimChar"/>
-              </w:rPr>
-              <w:t xml:space="preserve">/</w:t>
-            </w:r>
-          </w:p>
-        </w:tc>
         <w:tc>
           <w:tcPr/>
           <w:p>
@@ -14812,6 +14798,22 @@
             <w:pPr>
               <w:pStyle w:val="Compact"/>
             </w:pPr>
+            <w:hyperlink r:id="rId72">
+              <w:r>
+                <w:rPr>
+                  <w:rStyle w:val="Hyperlink"/>
+                </w:rPr>
+                <w:t xml:space="preserve">baba-it.onrender.com/</w:t>
+              </w:r>
+            </w:hyperlink>
+          </w:p>
+        </w:tc>
+        <w:tc>
+          <w:tcPr/>
+          <w:p>
+            <w:pPr>
+              <w:pStyle w:val="Compact"/>
+            </w:pPr>
             <w:r>
               <w:t xml:space="preserve">Customers</w:t>
             </w:r>
@@ -14824,26 +14826,12 @@
               <w:pStyle w:val="Compact"/>
             </w:pPr>
             <w:r>
-              <w:t xml:space="preserve">Catalogue, product pages, cart, checkout. Prices come from the pricing engine, freight from the shipping engine, suggestions from the basket builder.</w:t>
-            </w:r>
-          </w:p>
-        </w:tc>
-      </w:tr>
-      <w:tr>
-        <w:tc>
-          <w:tcPr/>
-          <w:p>
-            <w:pPr>
-              <w:pStyle w:val="Compact"/>
-            </w:pPr>
-            <w:r>
-              <w:rPr>
-                <w:rStyle w:val="VerbatimChar"/>
-              </w:rPr>
-              <w:t xml:space="preserve">/console</w:t>
-            </w:r>
-          </w:p>
-        </w:tc>
+              <w:t xml:space="preserve">Catalogue, product pages, cart, checkout. Prices from the pricing engine, freight from shipping, suggestions from the basket builder.</w:t>
+            </w:r>
+          </w:p>
+        </w:tc>
+      </w:tr>
+      <w:tr>
         <w:tc>
           <w:tcPr/>
           <w:p>
@@ -14865,6 +14853,22 @@
             <w:pPr>
               <w:pStyle w:val="Compact"/>
             </w:pPr>
+            <w:hyperlink r:id="rId73">
+              <w:r>
+                <w:rPr>
+                  <w:rStyle w:val="Hyperlink"/>
+                </w:rPr>
+                <w:t xml:space="preserve">/console</w:t>
+              </w:r>
+            </w:hyperlink>
+          </w:p>
+        </w:tc>
+        <w:tc>
+          <w:tcPr/>
+          <w:p>
+            <w:pPr>
+              <w:pStyle w:val="Compact"/>
+            </w:pPr>
             <w:r>
               <w:t xml:space="preserve">You</w:t>
             </w:r>
@@ -14877,26 +14881,12 @@
               <w:pStyle w:val="Compact"/>
             </w:pPr>
             <w:r>
-              <w:t xml:space="preserve">Runs the pipeline stages by hand, seeds demo data, simulates orders, and shows the state of every engine.</w:t>
-            </w:r>
-          </w:p>
-        </w:tc>
-      </w:tr>
-      <w:tr>
-        <w:tc>
-          <w:tcPr/>
-          <w:p>
-            <w:pPr>
-              <w:pStyle w:val="Compact"/>
-            </w:pPr>
-            <w:r>
-              <w:rPr>
-                <w:rStyle w:val="VerbatimChar"/>
-              </w:rPr>
-              <w:t xml:space="preserve">/ops</w:t>
-            </w:r>
-          </w:p>
-        </w:tc>
+              <w:t xml:space="preserve">Runs pipeline stages by hand, seeds demo data, simulates orders, shows every engine’s state.</w:t>
+            </w:r>
+          </w:p>
+        </w:tc>
+      </w:tr>
+      <w:tr>
         <w:tc>
           <w:tcPr/>
           <w:p>
@@ -14918,6 +14908,22 @@
             <w:pPr>
               <w:pStyle w:val="Compact"/>
             </w:pPr>
+            <w:hyperlink r:id="rId74">
+              <w:r>
+                <w:rPr>
+                  <w:rStyle w:val="Hyperlink"/>
+                </w:rPr>
+                <w:t xml:space="preserve">/ops</w:t>
+              </w:r>
+            </w:hyperlink>
+          </w:p>
+        </w:tc>
+        <w:tc>
+          <w:tcPr/>
+          <w:p>
+            <w:pPr>
+              <w:pStyle w:val="Compact"/>
+            </w:pPr>
             <w:r>
               <w:t xml:space="preserve">Reviewer</w:t>
             </w:r>
@@ -14930,26 +14936,12 @@
               <w:pStyle w:val="Compact"/>
             </w:pPr>
             <w:r>
-              <w:t xml:space="preserve">The 531 clustered decisions from section 8. Clear a cluster, move hundreds of SKUs.</w:t>
-            </w:r>
-          </w:p>
-        </w:tc>
-      </w:tr>
-      <w:tr>
-        <w:tc>
-          <w:tcPr/>
-          <w:p>
-            <w:pPr>
-              <w:pStyle w:val="Compact"/>
-            </w:pPr>
-            <w:r>
-              <w:rPr>
-                <w:rStyle w:val="VerbatimChar"/>
-              </w:rPr>
-              <w:t xml:space="preserve">/operator</w:t>
-            </w:r>
-          </w:p>
-        </w:tc>
+              <w:t xml:space="preserve">The 531 clustered decisions from section 8.</w:t>
+            </w:r>
+          </w:p>
+        </w:tc>
+      </w:tr>
+      <w:tr>
         <w:tc>
           <w:tcPr/>
           <w:p>
@@ -14971,6 +14963,22 @@
             <w:pPr>
               <w:pStyle w:val="Compact"/>
             </w:pPr>
+            <w:hyperlink r:id="rId75">
+              <w:r>
+                <w:rPr>
+                  <w:rStyle w:val="Hyperlink"/>
+                </w:rPr>
+                <w:t xml:space="preserve">/operator</w:t>
+              </w:r>
+            </w:hyperlink>
+          </w:p>
+        </w:tc>
+        <w:tc>
+          <w:tcPr/>
+          <w:p>
+            <w:pPr>
+              <w:pStyle w:val="Compact"/>
+            </w:pPr>
             <w:r>
               <w:t xml:space="preserve">Buyer in Delhi</w:t>
             </w:r>
@@ -14983,26 +14991,12 @@
               <w:pStyle w:val="Compact"/>
             </w:pPr>
             <w:r>
-              <w:t xml:space="preserve">Risk-ordered lines with deep links and the three confirmations from section 13.</w:t>
-            </w:r>
-          </w:p>
-        </w:tc>
-      </w:tr>
-      <w:tr>
-        <w:tc>
-          <w:tcPr/>
-          <w:p>
-            <w:pPr>
-              <w:pStyle w:val="Compact"/>
-            </w:pPr>
-            <w:r>
-              <w:rPr>
-                <w:rStyle w:val="VerbatimChar"/>
-              </w:rPr>
-              <w:t xml:space="preserve">/docs</w:t>
-            </w:r>
-          </w:p>
-        </w:tc>
+              <w:t xml:space="preserve">Risk-ordered lines, deep links, three confirmations.</w:t>
+            </w:r>
+          </w:p>
+        </w:tc>
+      </w:tr>
+      <w:tr>
         <w:tc>
           <w:tcPr/>
           <w:p>
@@ -15020,6 +15014,22 @@
             <w:pPr>
               <w:pStyle w:val="Compact"/>
             </w:pPr>
+            <w:hyperlink r:id="rId76">
+              <w:r>
+                <w:rPr>
+                  <w:rStyle w:val="Hyperlink"/>
+                </w:rPr>
+                <w:t xml:space="preserve">/docs</w:t>
+              </w:r>
+            </w:hyperlink>
+          </w:p>
+        </w:tc>
+        <w:tc>
+          <w:tcPr/>
+          <w:p>
+            <w:pPr>
+              <w:pStyle w:val="Compact"/>
+            </w:pPr>
             <w:r>
               <w:t xml:space="preserve">Developers</w:t>
             </w:r>
@@ -15045,20 +15055,6 @@
               <w:pStyle w:val="Compact"/>
             </w:pPr>
             <w:r>
-              <w:rPr>
-                <w:rStyle w:val="VerbatimChar"/>
-              </w:rPr>
-              <w:t xml:space="preserve">/legacy</w:t>
-            </w:r>
-          </w:p>
-        </w:tc>
-        <w:tc>
-          <w:tcPr/>
-          <w:p>
-            <w:pPr>
-              <w:pStyle w:val="Compact"/>
-            </w:pPr>
-            <w:r>
               <w:t xml:space="preserve">Old storefront</w:t>
             </w:r>
           </w:p>
@@ -15069,6 +15065,22 @@
             <w:pPr>
               <w:pStyle w:val="Compact"/>
             </w:pPr>
+            <w:hyperlink r:id="rId77">
+              <w:r>
+                <w:rPr>
+                  <w:rStyle w:val="Hyperlink"/>
+                </w:rPr>
+                <w:t xml:space="preserve">/legacy</w:t>
+              </w:r>
+            </w:hyperlink>
+          </w:p>
+        </w:tc>
+        <w:tc>
+          <w:tcPr/>
+          <w:p>
+            <w:pPr>
+              <w:pStyle w:val="Compact"/>
+            </w:pPr>
             <w:r>
               <w:t xml:space="preserve">—</w:t>
             </w:r>
@@ -15081,13 +15093,13 @@
               <w:pStyle w:val="Compact"/>
             </w:pPr>
             <w:r>
-              <w:t xml:space="preserve">The earlier single-page version, kept for reference.</w:t>
+              <w:t xml:space="preserve">The earlier single-page version.</w:t>
             </w:r>
           </w:p>
         </w:tc>
       </w:tr>
     </w:tbl>
-    <w:bookmarkStart w:id="72" w:name="X2d4b4488b337358cc151d7ceb924d2179f4ac92"/>
+    <w:bookmarkStart w:id="78" w:name="X2d4b4488b337358cc151d7ceb924d2179f4ac92"/>
     <w:p>
       <w:pPr>
         <w:pStyle w:val="Heading3"/>
@@ -15448,8 +15460,8 @@
         </w:tc>
       </w:tr>
     </w:tbl>
-    <w:bookmarkEnd w:id="72"/>
-    <w:bookmarkStart w:id="73" w:name="the-llm-tail-optional-by-design"/>
+    <w:bookmarkEnd w:id="78"/>
+    <w:bookmarkStart w:id="79" w:name="the-llm-tail-optional-by-design"/>
     <w:p>
       <w:pPr>
         <w:pStyle w:val="Heading3"/>
@@ -15559,9 +15571,9 @@
         <w:t xml:space="preserve">The pipeline degrades; it does not fail.</w:t>
       </w:r>
     </w:p>
-    <w:bookmarkEnd w:id="73"/>
-    <w:bookmarkEnd w:id="74"/>
-    <w:bookmarkStart w:id="79" w:name="what-is-real-and-what-is-a-snapshot"/>
+    <w:bookmarkEnd w:id="79"/>
+    <w:bookmarkEnd w:id="80"/>
+    <w:bookmarkStart w:id="85" w:name="what-is-real-and-what-is-a-snapshot"/>
     <w:p>
       <w:pPr>
         <w:pStyle w:val="Heading2"/>
@@ -15578,7 +15590,7 @@
         <w:t xml:space="preserve">What to say in a demo, before being asked.</w:t>
       </w:r>
     </w:p>
-    <w:bookmarkStart w:id="75" w:name="real-computes-live-per-request"/>
+    <w:bookmarkStart w:id="81" w:name="real-computes-live-per-request"/>
     <w:p>
       <w:pPr>
         <w:pStyle w:val="Heading3"/>
@@ -15595,8 +15607,8 @@
         <w:t xml:space="preserve">All nine engines execute on every order. Change a YAML rule and the next quote reflects it. Not recordings.</w:t>
       </w:r>
     </w:p>
-    <w:bookmarkEnd w:id="75"/>
-    <w:bookmarkStart w:id="76" w:name="a-snapshot-fixed-at-crawl-time"/>
+    <w:bookmarkEnd w:id="81"/>
+    <w:bookmarkStart w:id="82" w:name="a-snapshot-fixed-at-crawl-time"/>
     <w:p>
       <w:pPr>
         <w:pStyle w:val="Heading3"/>
@@ -15673,8 +15685,8 @@
         <w:t xml:space="preserve">, which require a real machine in India with a visible browser — not a code limitation, but what the source expects to see.</w:t>
       </w:r>
     </w:p>
-    <w:bookmarkEnd w:id="76"/>
-    <w:bookmarkStart w:id="77" w:name="the-three-consequences-stated-plainly"/>
+    <w:bookmarkEnd w:id="82"/>
+    <w:bookmarkStart w:id="83" w:name="the-three-consequences-stated-plainly"/>
     <w:p>
       <w:pPr>
         <w:pStyle w:val="Heading3"/>
@@ -15910,8 +15922,8 @@
         </w:tc>
       </w:tr>
     </w:tbl>
-    <w:bookmarkEnd w:id="77"/>
-    <w:bookmarkStart w:id="78" w:name="one-thing-to-know-about-the-deployment"/>
+    <w:bookmarkEnd w:id="83"/>
+    <w:bookmarkStart w:id="84" w:name="one-thing-to-know-about-the-deployment"/>
     <w:p>
       <w:pPr>
         <w:pStyle w:val="Heading3"/>
@@ -15962,9 +15974,9 @@
         <w:t xml:space="preserve">a complete decision system running on a frozen catalogue. The reasoning is real and inspectable; the products are a photograph.</w:t>
       </w:r>
     </w:p>
-    <w:bookmarkEnd w:id="78"/>
-    <w:bookmarkEnd w:id="79"/>
-    <w:bookmarkStart w:id="80" w:name="glossary"/>
+    <w:bookmarkEnd w:id="84"/>
+    <w:bookmarkEnd w:id="85"/>
+    <w:bookmarkStart w:id="86" w:name="glossary"/>
     <w:p>
       <w:pPr>
         <w:pStyle w:val="Heading2"/>
@@ -17128,8 +17140,1149 @@
         </w:tc>
       </w:tr>
     </w:tbl>
-    <w:bookmarkEnd w:id="80"/>
-    <w:bookmarkEnd w:id="81"/>
+    <w:bookmarkEnd w:id="86"/>
+    <w:bookmarkStart w:id="118" w:name="links"/>
+    <w:p>
+      <w:pPr>
+        <w:pStyle w:val="Heading2"/>
+      </w:pPr>
+      <w:r>
+        <w:t xml:space="preserve">19. Links</w:t>
+      </w:r>
+    </w:p>
+    <w:bookmarkStart w:id="87" w:name="live-system"/>
+    <w:p>
+      <w:pPr>
+        <w:pStyle w:val="Heading3"/>
+      </w:pPr>
+      <w:r>
+        <w:t xml:space="preserve">Live system</w:t>
+      </w:r>
+    </w:p>
+    <w:tbl>
+      <w:tblPr>
+        <w:tblStyle w:val="Table"/>
+        <w:tblW w:type="auto" w:w="0"/>
+        <w:tblLook w:firstRow="1" w:lastRow="0" w:firstColumn="0" w:lastColumn="0" w:noHBand="0" w:noVBand="0" w:val="0020"/>
+      </w:tblPr>
+      <w:tblGrid>
+        <w:gridCol w:w="3960"/>
+        <w:gridCol w:w="3960"/>
+      </w:tblGrid>
+      <w:tr>
+        <w:trPr>
+          <w:tblHeader w:val="on"/>
+        </w:trPr>
+        <w:tc>
+          <w:tcPr/>
+          <w:p>
+            <w:pPr>
+              <w:pStyle w:val="Compact"/>
+            </w:pPr>
+            <w:r>
+              <w:t xml:space="preserve">What</w:t>
+            </w:r>
+          </w:p>
+        </w:tc>
+        <w:tc>
+          <w:tcPr/>
+          <w:p>
+            <w:pPr>
+              <w:pStyle w:val="Compact"/>
+            </w:pPr>
+            <w:r>
+              <w:t xml:space="preserve">Link</w:t>
+            </w:r>
+          </w:p>
+        </w:tc>
+      </w:tr>
+      <w:tr>
+        <w:tc>
+          <w:tcPr/>
+          <w:p>
+            <w:pPr>
+              <w:pStyle w:val="Compact"/>
+            </w:pPr>
+            <w:r>
+              <w:t xml:space="preserve">Storefront</w:t>
+            </w:r>
+          </w:p>
+        </w:tc>
+        <w:tc>
+          <w:tcPr/>
+          <w:p>
+            <w:pPr>
+              <w:pStyle w:val="Compact"/>
+            </w:pPr>
+            <w:r>
+              <w:t xml:space="preserve">https://baba-it.onrender.com/</w:t>
+            </w:r>
+          </w:p>
+        </w:tc>
+      </w:tr>
+      <w:tr>
+        <w:tc>
+          <w:tcPr/>
+          <w:p>
+            <w:pPr>
+              <w:pStyle w:val="Compact"/>
+            </w:pPr>
+            <w:r>
+              <w:t xml:space="preserve">Control tower</w:t>
+            </w:r>
+          </w:p>
+        </w:tc>
+        <w:tc>
+          <w:tcPr/>
+          <w:p>
+            <w:pPr>
+              <w:pStyle w:val="Compact"/>
+            </w:pPr>
+            <w:r>
+              <w:t xml:space="preserve">https://baba-it.onrender.com/console</w:t>
+            </w:r>
+          </w:p>
+        </w:tc>
+      </w:tr>
+      <w:tr>
+        <w:tc>
+          <w:tcPr/>
+          <w:p>
+            <w:pPr>
+              <w:pStyle w:val="Compact"/>
+            </w:pPr>
+            <w:r>
+              <w:t xml:space="preserve">Compliance queue</w:t>
+            </w:r>
+          </w:p>
+        </w:tc>
+        <w:tc>
+          <w:tcPr/>
+          <w:p>
+            <w:pPr>
+              <w:pStyle w:val="Compact"/>
+            </w:pPr>
+            <w:r>
+              <w:t xml:space="preserve">https://baba-it.onrender.com/ops</w:t>
+            </w:r>
+          </w:p>
+        </w:tc>
+      </w:tr>
+      <w:tr>
+        <w:tc>
+          <w:tcPr/>
+          <w:p>
+            <w:pPr>
+              <w:pStyle w:val="Compact"/>
+            </w:pPr>
+            <w:r>
+              <w:t xml:space="preserve">Operator pick sheet</w:t>
+            </w:r>
+          </w:p>
+        </w:tc>
+        <w:tc>
+          <w:tcPr/>
+          <w:p>
+            <w:pPr>
+              <w:pStyle w:val="Compact"/>
+            </w:pPr>
+            <w:r>
+              <w:t xml:space="preserve">https://baba-it.onrender.com/operator</w:t>
+            </w:r>
+          </w:p>
+        </w:tc>
+      </w:tr>
+      <w:tr>
+        <w:tc>
+          <w:tcPr/>
+          <w:p>
+            <w:pPr>
+              <w:pStyle w:val="Compact"/>
+            </w:pPr>
+            <w:r>
+              <w:t xml:space="preserve">API reference (47 endpoints)</w:t>
+            </w:r>
+          </w:p>
+        </w:tc>
+        <w:tc>
+          <w:tcPr/>
+          <w:p>
+            <w:pPr>
+              <w:pStyle w:val="Compact"/>
+            </w:pPr>
+            <w:r>
+              <w:t xml:space="preserve">https://baba-it.onrender.com/docs</w:t>
+            </w:r>
+          </w:p>
+        </w:tc>
+      </w:tr>
+      <w:tr>
+        <w:tc>
+          <w:tcPr/>
+          <w:p>
+            <w:pPr>
+              <w:pStyle w:val="Compact"/>
+            </w:pPr>
+            <w:r>
+              <w:t xml:space="preserve">Old storefront</w:t>
+            </w:r>
+          </w:p>
+        </w:tc>
+        <w:tc>
+          <w:tcPr/>
+          <w:p>
+            <w:pPr>
+              <w:pStyle w:val="Compact"/>
+            </w:pPr>
+            <w:r>
+              <w:t xml:space="preserve">https://baba-it.onrender.com/legacy</w:t>
+            </w:r>
+          </w:p>
+        </w:tc>
+      </w:tr>
+    </w:tbl>
+    <w:p>
+      <w:pPr>
+        <w:pStyle w:val="BodyText"/>
+      </w:pPr>
+      <w:r>
+        <w:t xml:space="preserve">First request after idle takes 30–50 seconds — the host spins the service down between visits, and the catalogue is a 28 MB database.</w:t>
+      </w:r>
+    </w:p>
+    <w:bookmarkEnd w:id="87"/>
+    <w:bookmarkStart w:id="91" w:name="source"/>
+    <w:p>
+      <w:pPr>
+        <w:pStyle w:val="Heading3"/>
+      </w:pPr>
+      <w:r>
+        <w:t xml:space="preserve">Source</w:t>
+      </w:r>
+    </w:p>
+    <w:tbl>
+      <w:tblPr>
+        <w:tblStyle w:val="Table"/>
+        <w:tblW w:type="pct" w:w="5000"/>
+        <w:tblLayout w:type="fixed"/>
+        <w:tblLook w:firstRow="1" w:lastRow="0" w:firstColumn="0" w:lastColumn="0" w:noHBand="0" w:noVBand="0" w:val="0020"/>
+      </w:tblPr>
+      <w:tblGrid>
+        <w:gridCol w:w="3960"/>
+        <w:gridCol w:w="3960"/>
+      </w:tblGrid>
+      <w:tr>
+        <w:trPr>
+          <w:tblHeader w:val="on"/>
+        </w:trPr>
+        <w:tc>
+          <w:tcPr/>
+          <w:p>
+            <w:pPr>
+              <w:pStyle w:val="Compact"/>
+            </w:pPr>
+            <w:r>
+              <w:t xml:space="preserve">What</w:t>
+            </w:r>
+          </w:p>
+        </w:tc>
+        <w:tc>
+          <w:tcPr/>
+          <w:p>
+            <w:pPr>
+              <w:pStyle w:val="Compact"/>
+            </w:pPr>
+            <w:r>
+              <w:t xml:space="preserve">Link</w:t>
+            </w:r>
+          </w:p>
+        </w:tc>
+      </w:tr>
+      <w:tr>
+        <w:tc>
+          <w:tcPr/>
+          <w:p>
+            <w:pPr>
+              <w:pStyle w:val="Compact"/>
+            </w:pPr>
+            <w:r>
+              <w:t xml:space="preserve">Repository</w:t>
+            </w:r>
+          </w:p>
+        </w:tc>
+        <w:tc>
+          <w:tcPr/>
+          <w:p>
+            <w:pPr>
+              <w:pStyle w:val="Compact"/>
+            </w:pPr>
+            <w:r>
+              <w:t xml:space="preserve">https://github.com/sanyamgaur/Scrapper</w:t>
+            </w:r>
+          </w:p>
+        </w:tc>
+      </w:tr>
+      <w:tr>
+        <w:tc>
+          <w:tcPr/>
+          <w:p>
+            <w:pPr>
+              <w:pStyle w:val="Compact"/>
+            </w:pPr>
+            <w:r>
+              <w:t xml:space="preserve">This document (Markdown)</w:t>
+            </w:r>
+          </w:p>
+        </w:tc>
+        <w:tc>
+          <w:tcPr/>
+          <w:p>
+            <w:pPr>
+              <w:pStyle w:val="Compact"/>
+            </w:pPr>
+            <w:hyperlink r:id="rId88">
+              <w:r>
+                <w:rPr>
+                  <w:rStyle w:val="VerbatimChar"/>
+                </w:rPr>
+                <w:t xml:space="preserve">SYSTEM-EXPLAINER.md</w:t>
+              </w:r>
+            </w:hyperlink>
+          </w:p>
+        </w:tc>
+      </w:tr>
+      <w:tr>
+        <w:tc>
+          <w:tcPr/>
+          <w:p>
+            <w:pPr>
+              <w:pStyle w:val="Compact"/>
+            </w:pPr>
+            <w:r>
+              <w:t xml:space="preserve">Getting started</w:t>
+            </w:r>
+          </w:p>
+        </w:tc>
+        <w:tc>
+          <w:tcPr/>
+          <w:p>
+            <w:pPr>
+              <w:pStyle w:val="Compact"/>
+            </w:pPr>
+            <w:hyperlink r:id="rId89">
+              <w:r>
+                <w:rPr>
+                  <w:rStyle w:val="VerbatimChar"/>
+                </w:rPr>
+                <w:t xml:space="preserve">START-HERE.txt</w:t>
+              </w:r>
+            </w:hyperlink>
+          </w:p>
+        </w:tc>
+      </w:tr>
+      <w:tr>
+        <w:tc>
+          <w:tcPr/>
+          <w:p>
+            <w:pPr>
+              <w:pStyle w:val="Compact"/>
+            </w:pPr>
+            <w:r>
+              <w:t xml:space="preserve">Engine notes</w:t>
+            </w:r>
+          </w:p>
+        </w:tc>
+        <w:tc>
+          <w:tcPr/>
+          <w:p>
+            <w:pPr>
+              <w:pStyle w:val="Compact"/>
+            </w:pPr>
+            <w:hyperlink r:id="rId90">
+              <w:r>
+                <w:rPr>
+                  <w:rStyle w:val="VerbatimChar"/>
+                </w:rPr>
+                <w:t xml:space="preserve">crossborder/README.md</w:t>
+              </w:r>
+            </w:hyperlink>
+          </w:p>
+        </w:tc>
+      </w:tr>
+    </w:tbl>
+    <w:bookmarkEnd w:id="91"/>
+    <w:bookmarkStart w:id="96" w:name="the-rule-packs"/>
+    <w:p>
+      <w:pPr>
+        <w:pStyle w:val="Heading3"/>
+      </w:pPr>
+      <w:r>
+        <w:t xml:space="preserve">The rule packs</w:t>
+      </w:r>
+    </w:p>
+    <w:p>
+      <w:pPr>
+        <w:pStyle w:val="FirstParagraph"/>
+      </w:pPr>
+      <w:r>
+        <w:t xml:space="preserve">Every threshold in this document lives in one of these four files. Change policy here, never in code.</w:t>
+      </w:r>
+    </w:p>
+    <w:tbl>
+      <w:tblPr>
+        <w:tblStyle w:val="Table"/>
+        <w:tblW w:type="pct" w:w="5000"/>
+        <w:tblLayout w:type="fixed"/>
+        <w:tblLook w:firstRow="1" w:lastRow="0" w:firstColumn="0" w:lastColumn="0" w:noHBand="0" w:noVBand="0" w:val="0020"/>
+      </w:tblPr>
+      <w:tblGrid>
+        <w:gridCol w:w="3960"/>
+        <w:gridCol w:w="3960"/>
+      </w:tblGrid>
+      <w:tr>
+        <w:trPr>
+          <w:tblHeader w:val="on"/>
+        </w:trPr>
+        <w:tc>
+          <w:tcPr/>
+          <w:p>
+            <w:pPr>
+              <w:pStyle w:val="Compact"/>
+            </w:pPr>
+            <w:r>
+              <w:t xml:space="preserve">Engine</w:t>
+            </w:r>
+          </w:p>
+        </w:tc>
+        <w:tc>
+          <w:tcPr/>
+          <w:p>
+            <w:pPr>
+              <w:pStyle w:val="Compact"/>
+            </w:pPr>
+            <w:r>
+              <w:t xml:space="preserve">File</w:t>
+            </w:r>
+          </w:p>
+        </w:tc>
+      </w:tr>
+      <w:tr>
+        <w:tc>
+          <w:tcPr/>
+          <w:p>
+            <w:pPr>
+              <w:pStyle w:val="Compact"/>
+            </w:pPr>
+            <w:r>
+              <w:t xml:space="preserve">Compliance (sections 6–8)</w:t>
+            </w:r>
+          </w:p>
+        </w:tc>
+        <w:tc>
+          <w:tcPr/>
+          <w:p>
+            <w:pPr>
+              <w:pStyle w:val="Compact"/>
+            </w:pPr>
+            <w:hyperlink r:id="rId92">
+              <w:r>
+                <w:rPr>
+                  <w:rStyle w:val="VerbatimChar"/>
+                </w:rPr>
+                <w:t xml:space="preserve">rules/compliance.yaml</w:t>
+              </w:r>
+            </w:hyperlink>
+          </w:p>
+        </w:tc>
+      </w:tr>
+      <w:tr>
+        <w:tc>
+          <w:tcPr/>
+          <w:p>
+            <w:pPr>
+              <w:pStyle w:val="Compact"/>
+            </w:pPr>
+            <w:r>
+              <w:t xml:space="preserve">Pricing (section 9)</w:t>
+            </w:r>
+          </w:p>
+        </w:tc>
+        <w:tc>
+          <w:tcPr/>
+          <w:p>
+            <w:pPr>
+              <w:pStyle w:val="Compact"/>
+            </w:pPr>
+            <w:hyperlink r:id="rId93">
+              <w:r>
+                <w:rPr>
+                  <w:rStyle w:val="VerbatimChar"/>
+                </w:rPr>
+                <w:t xml:space="preserve">rules/pricing.yaml</w:t>
+              </w:r>
+            </w:hyperlink>
+          </w:p>
+        </w:tc>
+      </w:tr>
+      <w:tr>
+        <w:tc>
+          <w:tcPr/>
+          <w:p>
+            <w:pPr>
+              <w:pStyle w:val="Compact"/>
+            </w:pPr>
+            <w:r>
+              <w:t xml:space="preserve">Shipping + customs (sections 9–10)</w:t>
+            </w:r>
+          </w:p>
+        </w:tc>
+        <w:tc>
+          <w:tcPr/>
+          <w:p>
+            <w:pPr>
+              <w:pStyle w:val="Compact"/>
+            </w:pPr>
+            <w:hyperlink r:id="rId94">
+              <w:r>
+                <w:rPr>
+                  <w:rStyle w:val="VerbatimChar"/>
+                </w:rPr>
+                <w:t xml:space="preserve">rules/shipping.yaml</w:t>
+              </w:r>
+            </w:hyperlink>
+          </w:p>
+        </w:tc>
+      </w:tr>
+      <w:tr>
+        <w:tc>
+          <w:tcPr/>
+          <w:p>
+            <w:pPr>
+              <w:pStyle w:val="Compact"/>
+            </w:pPr>
+            <w:r>
+              <w:t xml:space="preserve">Stock, risk, procurement, drift, restock, basket (sections 11–15)</w:t>
+            </w:r>
+          </w:p>
+        </w:tc>
+        <w:tc>
+          <w:tcPr/>
+          <w:p>
+            <w:pPr>
+              <w:pStyle w:val="Compact"/>
+            </w:pPr>
+            <w:hyperlink r:id="rId95">
+              <w:r>
+                <w:rPr>
+                  <w:rStyle w:val="VerbatimChar"/>
+                </w:rPr>
+                <w:t xml:space="preserve">rules/procurement.yaml</w:t>
+              </w:r>
+            </w:hyperlink>
+          </w:p>
+        </w:tc>
+      </w:tr>
+    </w:tbl>
+    <w:bookmarkEnd w:id="96"/>
+    <w:bookmarkStart w:id="114" w:name="engine-source"/>
+    <w:p>
+      <w:pPr>
+        <w:pStyle w:val="Heading3"/>
+      </w:pPr>
+      <w:r>
+        <w:t xml:space="preserve">Engine source</w:t>
+      </w:r>
+    </w:p>
+    <w:tbl>
+      <w:tblPr>
+        <w:tblStyle w:val="Table"/>
+        <w:tblW w:type="pct" w:w="5000"/>
+        <w:tblLayout w:type="fixed"/>
+        <w:tblLook w:firstRow="1" w:lastRow="0" w:firstColumn="0" w:lastColumn="0" w:noHBand="0" w:noVBand="0" w:val="0020"/>
+      </w:tblPr>
+      <w:tblGrid>
+        <w:gridCol w:w="3960"/>
+        <w:gridCol w:w="3960"/>
+      </w:tblGrid>
+      <w:tr>
+        <w:trPr>
+          <w:tblHeader w:val="on"/>
+        </w:trPr>
+        <w:tc>
+          <w:tcPr/>
+          <w:p>
+            <w:pPr>
+              <w:pStyle w:val="Compact"/>
+            </w:pPr>
+            <w:r>
+              <w:t xml:space="preserve">Section</w:t>
+            </w:r>
+          </w:p>
+        </w:tc>
+        <w:tc>
+          <w:tcPr/>
+          <w:p>
+            <w:pPr>
+              <w:pStyle w:val="Compact"/>
+            </w:pPr>
+            <w:r>
+              <w:t xml:space="preserve">Module</w:t>
+            </w:r>
+          </w:p>
+        </w:tc>
+      </w:tr>
+      <w:tr>
+        <w:tc>
+          <w:tcPr/>
+          <w:p>
+            <w:pPr>
+              <w:pStyle w:val="Compact"/>
+            </w:pPr>
+            <w:r>
+              <w:t xml:space="preserve">5. Pack parsing</w:t>
+            </w:r>
+          </w:p>
+        </w:tc>
+        <w:tc>
+          <w:tcPr/>
+          <w:p>
+            <w:pPr>
+              <w:pStyle w:val="Compact"/>
+            </w:pPr>
+            <w:hyperlink r:id="rId97">
+              <w:r>
+                <w:rPr>
+                  <w:rStyle w:val="VerbatimChar"/>
+                </w:rPr>
+                <w:t xml:space="preserve">packparse.py</w:t>
+              </w:r>
+            </w:hyperlink>
+          </w:p>
+        </w:tc>
+      </w:tr>
+      <w:tr>
+        <w:tc>
+          <w:tcPr/>
+          <w:p>
+            <w:pPr>
+              <w:pStyle w:val="Compact"/>
+            </w:pPr>
+            <w:r>
+              <w:t xml:space="preserve">6–7. Compliance</w:t>
+            </w:r>
+          </w:p>
+        </w:tc>
+        <w:tc>
+          <w:tcPr/>
+          <w:p>
+            <w:pPr>
+              <w:pStyle w:val="Compact"/>
+            </w:pPr>
+            <w:hyperlink r:id="rId98">
+              <w:r>
+                <w:rPr>
+                  <w:rStyle w:val="VerbatimChar"/>
+                </w:rPr>
+                <w:t xml:space="preserve">compliance.py</w:t>
+              </w:r>
+            </w:hyperlink>
+          </w:p>
+        </w:tc>
+      </w:tr>
+      <w:tr>
+        <w:tc>
+          <w:tcPr/>
+          <w:p>
+            <w:pPr>
+              <w:pStyle w:val="Compact"/>
+            </w:pPr>
+            <w:r>
+              <w:t xml:space="preserve">8. Ops queue</w:t>
+            </w:r>
+          </w:p>
+        </w:tc>
+        <w:tc>
+          <w:tcPr/>
+          <w:p>
+            <w:pPr>
+              <w:pStyle w:val="Compact"/>
+            </w:pPr>
+            <w:hyperlink r:id="rId99">
+              <w:r>
+                <w:rPr>
+                  <w:rStyle w:val="VerbatimChar"/>
+                </w:rPr>
+                <w:t xml:space="preserve">operator.py</w:t>
+              </w:r>
+            </w:hyperlink>
+          </w:p>
+        </w:tc>
+      </w:tr>
+      <w:tr>
+        <w:tc>
+          <w:tcPr/>
+          <w:p>
+            <w:pPr>
+              <w:pStyle w:val="Compact"/>
+            </w:pPr>
+            <w:r>
+              <w:t xml:space="preserve">9. Pricing</w:t>
+            </w:r>
+          </w:p>
+        </w:tc>
+        <w:tc>
+          <w:tcPr/>
+          <w:p>
+            <w:pPr>
+              <w:pStyle w:val="Compact"/>
+            </w:pPr>
+            <w:hyperlink r:id="rId100">
+              <w:r>
+                <w:rPr>
+                  <w:rStyle w:val="VerbatimChar"/>
+                </w:rPr>
+                <w:t xml:space="preserve">pricing.py</w:t>
+              </w:r>
+            </w:hyperlink>
+          </w:p>
+        </w:tc>
+      </w:tr>
+      <w:tr>
+        <w:tc>
+          <w:tcPr/>
+          <w:p>
+            <w:pPr>
+              <w:pStyle w:val="Compact"/>
+            </w:pPr>
+            <w:r>
+              <w:t xml:space="preserve">10. Shipping</w:t>
+            </w:r>
+          </w:p>
+        </w:tc>
+        <w:tc>
+          <w:tcPr/>
+          <w:p>
+            <w:pPr>
+              <w:pStyle w:val="Compact"/>
+            </w:pPr>
+            <w:hyperlink r:id="rId101">
+              <w:r>
+                <w:rPr>
+                  <w:rStyle w:val="VerbatimChar"/>
+                </w:rPr>
+                <w:t xml:space="preserve">shipping.py</w:t>
+              </w:r>
+            </w:hyperlink>
+          </w:p>
+        </w:tc>
+      </w:tr>
+      <w:tr>
+        <w:tc>
+          <w:tcPr/>
+          <w:p>
+            <w:pPr>
+              <w:pStyle w:val="Compact"/>
+            </w:pPr>
+            <w:r>
+              <w:t xml:space="preserve">11. Stock</w:t>
+            </w:r>
+          </w:p>
+        </w:tc>
+        <w:tc>
+          <w:tcPr/>
+          <w:p>
+            <w:pPr>
+              <w:pStyle w:val="Compact"/>
+            </w:pPr>
+            <w:hyperlink r:id="rId102">
+              <w:r>
+                <w:rPr>
+                  <w:rStyle w:val="VerbatimChar"/>
+                </w:rPr>
+                <w:t xml:space="preserve">stock.py</w:t>
+              </w:r>
+            </w:hyperlink>
+            <w:r>
+              <w:t xml:space="preserve"> </w:t>
+            </w:r>
+            <w:r>
+              <w:t xml:space="preserve">·</w:t>
+            </w:r>
+            <w:r>
+              <w:t xml:space="preserve"> </w:t>
+            </w:r>
+            <w:hyperlink r:id="rId103">
+              <w:r>
+                <w:rPr>
+                  <w:rStyle w:val="VerbatimChar"/>
+                </w:rPr>
+                <w:t xml:space="preserve">availability_engine.py</w:t>
+              </w:r>
+            </w:hyperlink>
+          </w:p>
+        </w:tc>
+      </w:tr>
+      <w:tr>
+        <w:tc>
+          <w:tcPr/>
+          <w:p>
+            <w:pPr>
+              <w:pStyle w:val="Compact"/>
+            </w:pPr>
+            <w:r>
+              <w:t xml:space="preserve">12. Stockout risk</w:t>
+            </w:r>
+          </w:p>
+        </w:tc>
+        <w:tc>
+          <w:tcPr/>
+          <w:p>
+            <w:pPr>
+              <w:pStyle w:val="Compact"/>
+            </w:pPr>
+            <w:hyperlink r:id="rId104">
+              <w:r>
+                <w:rPr>
+                  <w:rStyle w:val="VerbatimChar"/>
+                </w:rPr>
+                <w:t xml:space="preserve">stockout_risk.py</w:t>
+              </w:r>
+            </w:hyperlink>
+          </w:p>
+        </w:tc>
+      </w:tr>
+      <w:tr>
+        <w:tc>
+          <w:tcPr/>
+          <w:p>
+            <w:pPr>
+              <w:pStyle w:val="Compact"/>
+            </w:pPr>
+            <w:r>
+              <w:t xml:space="preserve">13. Procurement</w:t>
+            </w:r>
+          </w:p>
+        </w:tc>
+        <w:tc>
+          <w:tcPr/>
+          <w:p>
+            <w:pPr>
+              <w:pStyle w:val="Compact"/>
+            </w:pPr>
+            <w:hyperlink r:id="rId105">
+              <w:r>
+                <w:rPr>
+                  <w:rStyle w:val="VerbatimChar"/>
+                </w:rPr>
+                <w:t xml:space="preserve">procurement.py</w:t>
+              </w:r>
+            </w:hyperlink>
+          </w:p>
+        </w:tc>
+      </w:tr>
+      <w:tr>
+        <w:tc>
+          <w:tcPr/>
+          <w:p>
+            <w:pPr>
+              <w:pStyle w:val="Compact"/>
+            </w:pPr>
+            <w:r>
+              <w:t xml:space="preserve">14. Price drift</w:t>
+            </w:r>
+          </w:p>
+        </w:tc>
+        <w:tc>
+          <w:tcPr/>
+          <w:p>
+            <w:pPr>
+              <w:pStyle w:val="Compact"/>
+            </w:pPr>
+            <w:hyperlink r:id="rId106">
+              <w:r>
+                <w:rPr>
+                  <w:rStyle w:val="VerbatimChar"/>
+                </w:rPr>
+                <w:t xml:space="preserve">pricedrift.py</w:t>
+              </w:r>
+            </w:hyperlink>
+          </w:p>
+        </w:tc>
+      </w:tr>
+      <w:tr>
+        <w:tc>
+          <w:tcPr/>
+          <w:p>
+            <w:pPr>
+              <w:pStyle w:val="Compact"/>
+            </w:pPr>
+            <w:r>
+              <w:t xml:space="preserve">15. Restock · Basket</w:t>
+            </w:r>
+          </w:p>
+        </w:tc>
+        <w:tc>
+          <w:tcPr/>
+          <w:p>
+            <w:pPr>
+              <w:pStyle w:val="Compact"/>
+            </w:pPr>
+            <w:hyperlink r:id="rId107">
+              <w:r>
+                <w:rPr>
+                  <w:rStyle w:val="VerbatimChar"/>
+                </w:rPr>
+                <w:t xml:space="preserve">restock.py</w:t>
+              </w:r>
+            </w:hyperlink>
+            <w:r>
+              <w:t xml:space="preserve"> </w:t>
+            </w:r>
+            <w:r>
+              <w:t xml:space="preserve">·</w:t>
+            </w:r>
+            <w:r>
+              <w:t xml:space="preserve"> </w:t>
+            </w:r>
+            <w:hyperlink r:id="rId108">
+              <w:r>
+                <w:rPr>
+                  <w:rStyle w:val="VerbatimChar"/>
+                </w:rPr>
+                <w:t xml:space="preserve">basket.py</w:t>
+              </w:r>
+            </w:hyperlink>
+          </w:p>
+        </w:tc>
+      </w:tr>
+      <w:tr>
+        <w:tc>
+          <w:tcPr/>
+          <w:p>
+            <w:pPr>
+              <w:pStyle w:val="Compact"/>
+            </w:pPr>
+            <w:r>
+              <w:t xml:space="preserve">16. API · console</w:t>
+            </w:r>
+          </w:p>
+        </w:tc>
+        <w:tc>
+          <w:tcPr/>
+          <w:p>
+            <w:pPr>
+              <w:pStyle w:val="Compact"/>
+            </w:pPr>
+            <w:hyperlink r:id="rId109">
+              <w:r>
+                <w:rPr>
+                  <w:rStyle w:val="VerbatimChar"/>
+                </w:rPr>
+                <w:t xml:space="preserve">api.py</w:t>
+              </w:r>
+            </w:hyperlink>
+            <w:r>
+              <w:t xml:space="preserve"> </w:t>
+            </w:r>
+            <w:r>
+              <w:t xml:space="preserve">·</w:t>
+            </w:r>
+            <w:r>
+              <w:t xml:space="preserve"> </w:t>
+            </w:r>
+            <w:hyperlink r:id="rId110">
+              <w:r>
+                <w:rPr>
+                  <w:rStyle w:val="VerbatimChar"/>
+                </w:rPr>
+                <w:t xml:space="preserve">console.py</w:t>
+              </w:r>
+            </w:hyperlink>
+          </w:p>
+        </w:tc>
+      </w:tr>
+      <w:tr>
+        <w:tc>
+          <w:tcPr/>
+          <w:p>
+            <w:pPr>
+              <w:pStyle w:val="Compact"/>
+            </w:pPr>
+            <w:r>
+              <w:t xml:space="preserve">16. LLM tail</w:t>
+            </w:r>
+          </w:p>
+        </w:tc>
+        <w:tc>
+          <w:tcPr/>
+          <w:p>
+            <w:pPr>
+              <w:pStyle w:val="Compact"/>
+            </w:pPr>
+            <w:hyperlink r:id="rId111">
+              <w:r>
+                <w:rPr>
+                  <w:rStyle w:val="VerbatimChar"/>
+                </w:rPr>
+                <w:t xml:space="preserve">llm.py</w:t>
+              </w:r>
+            </w:hyperlink>
+          </w:p>
+        </w:tc>
+      </w:tr>
+      <w:tr>
+        <w:tc>
+          <w:tcPr/>
+          <w:p>
+            <w:pPr>
+              <w:pStyle w:val="Compact"/>
+            </w:pPr>
+            <w:r>
+              <w:t xml:space="preserve">17. Scraper</w:t>
+            </w:r>
+          </w:p>
+        </w:tc>
+        <w:tc>
+          <w:tcPr/>
+          <w:p>
+            <w:pPr>
+              <w:pStyle w:val="Compact"/>
+            </w:pPr>
+            <w:hyperlink r:id="rId112">
+              <w:r>
+                <w:rPr>
+                  <w:rStyle w:val="VerbatimChar"/>
+                </w:rPr>
+                <w:t xml:space="preserve">crawl.py</w:t>
+              </w:r>
+            </w:hyperlink>
+            <w:r>
+              <w:t xml:space="preserve"> </w:t>
+            </w:r>
+            <w:r>
+              <w:t xml:space="preserve">·</w:t>
+            </w:r>
+            <w:r>
+              <w:t xml:space="preserve"> </w:t>
+            </w:r>
+            <w:hyperlink r:id="rId113">
+              <w:r>
+                <w:rPr>
+                  <w:rStyle w:val="VerbatimChar"/>
+                </w:rPr>
+                <w:t xml:space="preserve">discover.py</w:t>
+              </w:r>
+            </w:hyperlink>
+          </w:p>
+        </w:tc>
+      </w:tr>
+    </w:tbl>
+    <w:bookmarkEnd w:id="114"/>
+    <w:bookmarkStart w:id="117" w:name="on-the-legal-citations"/>
+    <w:p>
+      <w:pPr>
+        <w:pStyle w:val="Heading3"/>
+      </w:pPr>
+      <w:r>
+        <w:t xml:space="preserve">On the legal citations</w:t>
+      </w:r>
+    </w:p>
+    <w:p>
+      <w:pPr>
+        <w:pStyle w:val="FirstParagraph"/>
+      </w:pPr>
+      <w:r>
+        <w:t xml:space="preserve">The authorities in section 7 (</w:t>
+      </w:r>
+      <w:r>
+        <w:rPr>
+          <w:rStyle w:val="VerbatimChar"/>
+        </w:rPr>
+        <w:t xml:space="preserve">9 CFR 94</w:t>
+      </w:r>
+      <w:r>
+        <w:t xml:space="preserve">,</w:t>
+      </w:r>
+      <w:r>
+        <w:t xml:space="preserve"> </w:t>
+      </w:r>
+      <w:r>
+        <w:rPr>
+          <w:rStyle w:val="VerbatimChar"/>
+        </w:rPr>
+        <w:t xml:space="preserve">FDA Import Alert 53-19</w:t>
+      </w:r>
+      <w:r>
+        <w:t xml:space="preserve">,</w:t>
+      </w:r>
+      <w:r>
+        <w:t xml:space="preserve"> </w:t>
+      </w:r>
+      <w:r>
+        <w:rPr>
+          <w:rStyle w:val="VerbatimChar"/>
+        </w:rPr>
+        <w:t xml:space="preserve">IATA DGR UN1950</w:t>
+      </w:r>
+      <w:r>
+        <w:t xml:space="preserve"> </w:t>
+      </w:r>
+      <w:r>
+        <w:t xml:space="preserve">and the rest) are quoted from the rule pack and are</w:t>
+      </w:r>
+      <w:r>
+        <w:t xml:space="preserve"> </w:t>
+      </w:r>
+      <w:r>
+        <w:rPr>
+          <w:b/>
+          <w:bCs/>
+        </w:rPr>
+        <w:t xml:space="preserve">not linked here</w:t>
+      </w:r>
+      <w:r>
+        <w:t xml:space="preserve"> </w:t>
+      </w:r>
+      <w:r>
+        <w:t xml:space="preserve">— they were not fetched or verified against the issuing bodies while writing this document. Look each one up at</w:t>
+      </w:r>
+      <w:r>
+        <w:t xml:space="preserve"> </w:t>
+      </w:r>
+      <w:hyperlink r:id="rId115">
+        <w:r>
+          <w:rPr>
+            <w:rStyle w:val="Hyperlink"/>
+          </w:rPr>
+          <w:t xml:space="preserve">ecfr.gov</w:t>
+        </w:r>
+      </w:hyperlink>
+      <w:r>
+        <w:t xml:space="preserve"> </w:t>
+      </w:r>
+      <w:r>
+        <w:t xml:space="preserve">or</w:t>
+      </w:r>
+      <w:r>
+        <w:t xml:space="preserve"> </w:t>
+      </w:r>
+      <w:hyperlink r:id="rId116">
+        <w:r>
+          <w:rPr>
+            <w:rStyle w:val="Hyperlink"/>
+          </w:rPr>
+          <w:t xml:space="preserve">fda.gov</w:t>
+        </w:r>
+      </w:hyperlink>
+      <w:r>
+        <w:t xml:space="preserve"> </w:t>
+      </w:r>
+      <w:r>
+        <w:t xml:space="preserve">before relying on it, and have a licensed customs broker sign off, as the rule pack itself says.</w:t>
+      </w:r>
+    </w:p>
+    <w:bookmarkEnd w:id="117"/>
+    <w:bookmarkEnd w:id="118"/>
+    <w:bookmarkEnd w:id="119"/>
     <w:sectPr>
       <w:footnotePr>
         <w:numRestart w:val="eachSect"/>

</xml_diff>